<commit_message>
feat: align lesson and quiz statuses and expand demo data
</commit_message>
<xml_diff>
--- a/docs/2_SDS.docx
+++ b/docs/2_SDS.docx
@@ -23,12 +23,12 @@
           <wp:inline distB="0" distT="0" distL="0" distR="0">
             <wp:extent cx="2707537" cy="832092"/>
             <wp:effectExtent b="0" l="0" r="0" t="0"/>
-            <wp:docPr id="29" name="image1.png"/>
+            <wp:docPr id="30" name="image3.png"/>
             <a:graphic>
               <a:graphicData uri="http://schemas.openxmlformats.org/drawingml/2006/picture">
                 <pic:pic>
                   <pic:nvPicPr>
-                    <pic:cNvPr id="0" name="image1.png"/>
+                    <pic:cNvPr id="0" name="image3.png"/>
                     <pic:cNvPicPr preferRelativeResize="0"/>
                   </pic:nvPicPr>
                   <pic:blipFill>
@@ -375,7 +375,7 @@
     </w:p>
     <w:sdt>
       <w:sdtPr>
-        <w:id w:val="1943825860"/>
+        <w:id w:val="1413152495"/>
         <w:docPartObj>
           <w:docPartGallery w:val="Table of Contents"/>
           <w:docPartUnique w:val="1"/>
@@ -1887,15 +1887,7 @@
               </w:rPr>
               <w:t xml:space="preserve">27/09/2026</w:t>
             </w:r>
-            <w:r>
-              <w:rPr>
-                <w:rtl w:val="0"/>
-              </w:rPr>
-            </w:r>
-          </w:p>
-        </w:tc>
-        <w:tc>
-          <w:tcPr/>
+          </w:p>
           <w:p>
             <w:pPr>
               <w:keepNext w:val="0"/>
@@ -1921,12 +1913,8 @@
             </w:pPr>
             <w:r>
               <w:rPr>
-                <w:rFonts w:ascii="Tahoma" w:cs="Tahoma" w:eastAsia="Tahoma" w:hAnsi="Tahoma"/>
-                <w:sz w:val="18"/>
-                <w:szCs w:val="18"/>
-                <w:rtl w:val="0"/>
-              </w:rPr>
-              <w:t xml:space="preserve">A</w:t>
+                <w:rtl w:val="0"/>
+              </w:rPr>
             </w:r>
           </w:p>
           <w:p>
@@ -1954,10 +1942,22 @@
             </w:pPr>
             <w:r>
               <w:rPr>
-                <w:rtl w:val="0"/>
-              </w:rPr>
-            </w:r>
-          </w:p>
+                <w:rFonts w:ascii="Tahoma" w:cs="Tahoma" w:eastAsia="Tahoma" w:hAnsi="Tahoma"/>
+                <w:sz w:val="18"/>
+                <w:szCs w:val="18"/>
+                <w:rtl w:val="0"/>
+              </w:rPr>
+              <w:t xml:space="preserve">03/10/2026</w:t>
+            </w:r>
+            <w:r>
+              <w:rPr>
+                <w:rtl w:val="0"/>
+              </w:rPr>
+            </w:r>
+          </w:p>
+        </w:tc>
+        <w:tc>
+          <w:tcPr/>
           <w:p>
             <w:pPr>
               <w:keepNext w:val="0"/>
@@ -1983,8 +1983,12 @@
             </w:pPr>
             <w:r>
               <w:rPr>
-                <w:rtl w:val="0"/>
-              </w:rPr>
+                <w:rFonts w:ascii="Tahoma" w:cs="Tahoma" w:eastAsia="Tahoma" w:hAnsi="Tahoma"/>
+                <w:sz w:val="18"/>
+                <w:szCs w:val="18"/>
+                <w:rtl w:val="0"/>
+              </w:rPr>
+              <w:t xml:space="preserve">A</w:t>
             </w:r>
           </w:p>
           <w:p>
@@ -2012,12 +2016,8 @@
             </w:pPr>
             <w:r>
               <w:rPr>
-                <w:rFonts w:ascii="Tahoma" w:cs="Tahoma" w:eastAsia="Tahoma" w:hAnsi="Tahoma"/>
-                <w:sz w:val="18"/>
-                <w:szCs w:val="18"/>
-                <w:rtl w:val="0"/>
-              </w:rPr>
-              <w:t xml:space="preserve">M</w:t>
+                <w:rtl w:val="0"/>
+              </w:rPr>
             </w:r>
           </w:p>
           <w:p>
@@ -2079,7 +2079,7 @@
                 <w:szCs w:val="18"/>
                 <w:rtl w:val="0"/>
               </w:rPr>
-              <w:t xml:space="preserve">A</w:t>
+              <w:t xml:space="preserve">M</w:t>
             </w:r>
           </w:p>
           <w:p>
@@ -2144,9 +2144,6 @@
               <w:t xml:space="preserve">A</w:t>
             </w:r>
           </w:p>
-        </w:tc>
-        <w:tc>
-          <w:tcPr/>
           <w:p>
             <w:pPr>
               <w:keepNext w:val="0"/>
@@ -2166,38 +2163,16 @@
               <w:jc w:val="left"/>
               <w:rPr>
                 <w:rFonts w:ascii="Tahoma" w:cs="Tahoma" w:eastAsia="Tahoma" w:hAnsi="Tahoma"/>
-                <w:b w:val="0"/>
-                <w:bCs w:val="0"/>
-                <w:i w:val="0"/>
-                <w:iCs w:val="0"/>
-                <w:smallCaps w:val="0"/>
-                <w:strike w:val="0"/>
-                <w:color w:val="000000"/>
                 <w:sz w:val="18"/>
                 <w:szCs w:val="18"/>
-                <w:u w:val="none"/>
-                <w:shd w:fill="auto" w:val="clear"/>
-                <w:vertAlign w:val="baseline"/>
-              </w:rPr>
-            </w:pPr>
-            <w:r>
-              <w:rPr>
-                <w:rFonts w:ascii="Tahoma" w:cs="Tahoma" w:eastAsia="Tahoma" w:hAnsi="Tahoma"/>
-                <w:sz w:val="18"/>
-                <w:szCs w:val="18"/>
-                <w:rtl w:val="0"/>
-              </w:rPr>
-              <w:t xml:space="preserve">KienLC</w:t>
-            </w:r>
-            <w:r>
-              <w:rPr>
-                <w:rtl w:val="0"/>
-              </w:rPr>
-            </w:r>
-          </w:p>
-        </w:tc>
-        <w:tc>
-          <w:tcPr/>
+              </w:rPr>
+            </w:pPr>
+            <w:r>
+              <w:rPr>
+                <w:rtl w:val="0"/>
+              </w:rPr>
+            </w:r>
+          </w:p>
           <w:p>
             <w:pPr>
               <w:keepNext w:val="0"/>
@@ -2228,18 +2203,15 @@
                 <w:szCs w:val="18"/>
                 <w:rtl w:val="0"/>
               </w:rPr>
-              <w:t xml:space="preserve">I.3 Added Database Design and filled information into tables</w:t>
+              <w:t xml:space="preserve">A</w:t>
               <w:br w:type="textWrapping"/>
               <w:br w:type="textWrapping"/>
-              <w:br w:type="textWrapping"/>
-              <w:br w:type="textWrapping"/>
-              <w:t xml:space="preserve">I.3 Modified Database Design</w:t>
-              <w:br w:type="textWrapping"/>
-              <w:br w:type="textWrapping"/>
-              <w:br w:type="textWrapping"/>
-              <w:t xml:space="preserve">II.1. Added User Management &amp; User Details</w:t>
-            </w:r>
-          </w:p>
+              <w:t xml:space="preserve">M</w:t>
+            </w:r>
+          </w:p>
+        </w:tc>
+        <w:tc>
+          <w:tcPr/>
           <w:p>
             <w:pPr>
               <w:keepNext w:val="0"/>
@@ -2259,16 +2231,38 @@
               <w:jc w:val="left"/>
               <w:rPr>
                 <w:rFonts w:ascii="Tahoma" w:cs="Tahoma" w:eastAsia="Tahoma" w:hAnsi="Tahoma"/>
+                <w:b w:val="0"/>
+                <w:bCs w:val="0"/>
+                <w:i w:val="0"/>
+                <w:iCs w:val="0"/>
+                <w:smallCaps w:val="0"/>
+                <w:strike w:val="0"/>
+                <w:color w:val="000000"/>
                 <w:sz w:val="18"/>
                 <w:szCs w:val="18"/>
-              </w:rPr>
-            </w:pPr>
-            <w:r>
-              <w:rPr>
-                <w:rtl w:val="0"/>
-              </w:rPr>
-            </w:r>
-          </w:p>
+                <w:u w:val="none"/>
+                <w:shd w:fill="auto" w:val="clear"/>
+                <w:vertAlign w:val="baseline"/>
+              </w:rPr>
+            </w:pPr>
+            <w:r>
+              <w:rPr>
+                <w:rFonts w:ascii="Tahoma" w:cs="Tahoma" w:eastAsia="Tahoma" w:hAnsi="Tahoma"/>
+                <w:sz w:val="18"/>
+                <w:szCs w:val="18"/>
+                <w:rtl w:val="0"/>
+              </w:rPr>
+              <w:t xml:space="preserve">KienLC</w:t>
+            </w:r>
+            <w:r>
+              <w:rPr>
+                <w:rtl w:val="0"/>
+              </w:rPr>
+            </w:r>
+          </w:p>
+        </w:tc>
+        <w:tc>
+          <w:tcPr/>
           <w:p>
             <w:pPr>
               <w:keepNext w:val="0"/>
@@ -2299,7 +2293,16 @@
                 <w:szCs w:val="18"/>
                 <w:rtl w:val="0"/>
               </w:rPr>
-              <w:t xml:space="preserve">II.1. Modified User Management &amp; User Details</w:t>
+              <w:t xml:space="preserve">I.3 Added Database Design and filled information into tables</w:t>
+              <w:br w:type="textWrapping"/>
+              <w:br w:type="textWrapping"/>
+              <w:br w:type="textWrapping"/>
+              <w:br w:type="textWrapping"/>
+              <w:t xml:space="preserve">I.3 Modified Database Design</w:t>
+              <w:br w:type="textWrapping"/>
+              <w:br w:type="textWrapping"/>
+              <w:br w:type="textWrapping"/>
+              <w:t xml:space="preserve">II.1. Added User Management &amp; User Details</w:t>
             </w:r>
           </w:p>
           <w:p>
@@ -2327,12 +2330,76 @@
             </w:pPr>
             <w:r>
               <w:rPr>
+                <w:rtl w:val="0"/>
+              </w:rPr>
+            </w:r>
+          </w:p>
+          <w:p>
+            <w:pPr>
+              <w:keepNext w:val="0"/>
+              <w:keepLines w:val="0"/>
+              <w:pageBreakBefore w:val="0"/>
+              <w:widowControl w:val="1"/>
+              <w:pBdr>
+                <w:top w:space="0" w:sz="0" w:val="nil"/>
+                <w:left w:space="0" w:sz="0" w:val="nil"/>
+                <w:bottom w:space="0" w:sz="0" w:val="nil"/>
+                <w:right w:space="0" w:sz="0" w:val="nil"/>
+                <w:between w:space="0" w:sz="0" w:val="nil"/>
+              </w:pBdr>
+              <w:shd w:fill="auto" w:val="clear"/>
+              <w:spacing w:after="80" w:before="80" w:line="240" w:lineRule="auto"/>
+              <w:ind w:left="0" w:right="0" w:firstLine="0"/>
+              <w:jc w:val="left"/>
+              <w:rPr>
                 <w:rFonts w:ascii="Tahoma" w:cs="Tahoma" w:eastAsia="Tahoma" w:hAnsi="Tahoma"/>
                 <w:sz w:val="18"/>
                 <w:szCs w:val="18"/>
+              </w:rPr>
+            </w:pPr>
+            <w:r>
+              <w:rPr>
+                <w:rFonts w:ascii="Tahoma" w:cs="Tahoma" w:eastAsia="Tahoma" w:hAnsi="Tahoma"/>
+                <w:sz w:val="18"/>
+                <w:szCs w:val="18"/>
+                <w:rtl w:val="0"/>
+              </w:rPr>
+              <w:t xml:space="preserve">II.1. Modified User Management &amp; User Details</w:t>
+            </w:r>
+          </w:p>
+          <w:p>
+            <w:pPr>
+              <w:keepNext w:val="0"/>
+              <w:keepLines w:val="0"/>
+              <w:pageBreakBefore w:val="0"/>
+              <w:widowControl w:val="1"/>
+              <w:pBdr>
+                <w:top w:space="0" w:sz="0" w:val="nil"/>
+                <w:left w:space="0" w:sz="0" w:val="nil"/>
+                <w:bottom w:space="0" w:sz="0" w:val="nil"/>
+                <w:right w:space="0" w:sz="0" w:val="nil"/>
+                <w:between w:space="0" w:sz="0" w:val="nil"/>
+              </w:pBdr>
+              <w:shd w:fill="auto" w:val="clear"/>
+              <w:spacing w:after="80" w:before="80" w:line="240" w:lineRule="auto"/>
+              <w:ind w:left="0" w:right="0" w:firstLine="0"/>
+              <w:jc w:val="left"/>
+              <w:rPr>
+                <w:rFonts w:ascii="Tahoma" w:cs="Tahoma" w:eastAsia="Tahoma" w:hAnsi="Tahoma"/>
+                <w:sz w:val="18"/>
+                <w:szCs w:val="18"/>
+              </w:rPr>
+            </w:pPr>
+            <w:r>
+              <w:rPr>
+                <w:rFonts w:ascii="Tahoma" w:cs="Tahoma" w:eastAsia="Tahoma" w:hAnsi="Tahoma"/>
+                <w:sz w:val="18"/>
+                <w:szCs w:val="18"/>
                 <w:rtl w:val="0"/>
               </w:rPr>
               <w:t xml:space="preserve">II.4. Modified Class diagram Quiz Submission &amp; Scoring</w:t>
+              <w:br w:type="textWrapping"/>
+              <w:t xml:space="preserve">I.3 Modified Database Design</w:t>
             </w:r>
           </w:p>
         </w:tc>
@@ -6730,12 +6797,12 @@
           <wp:inline distB="114300" distT="114300" distL="114300" distR="114300">
             <wp:extent cx="5731200" cy="5257800"/>
             <wp:effectExtent b="0" l="0" r="0" t="0"/>
-            <wp:docPr id="36" name="image16.jpg"/>
+            <wp:docPr id="36" name="image12.jpg"/>
             <a:graphic>
               <a:graphicData uri="http://schemas.openxmlformats.org/drawingml/2006/picture">
                 <pic:pic>
                   <pic:nvPicPr>
-                    <pic:cNvPr id="0" name="image16.jpg"/>
+                    <pic:cNvPr id="0" name="image12.jpg"/>
                     <pic:cNvPicPr preferRelativeResize="0"/>
                   </pic:nvPicPr>
                   <pic:blipFill>
@@ -7808,6 +7875,7 @@
     <w:p>
       <w:pPr>
         <w:pStyle w:val="Heading2"/>
+        <w:spacing w:line="276" w:lineRule="auto"/>
         <w:rPr/>
       </w:pPr>
       <w:bookmarkStart w:colFirst="0" w:colLast="0" w:name="_heading=h.qrijbw8vhler" w:id="3"/>
@@ -7826,21 +7894,29 @@
     </w:p>
     <w:p>
       <w:pPr>
+        <w:spacing w:line="276" w:lineRule="auto"/>
         <w:jc w:val="center"/>
-        <w:rPr/>
+        <w:rPr>
+          <w:b w:val="1"/>
+          <w:bCs w:val="1"/>
+          <w:i w:val="1"/>
+          <w:iCs w:val="1"/>
+          <w:sz w:val="24"/>
+          <w:szCs w:val="24"/>
+        </w:rPr>
       </w:pPr>
       <w:r>
         <w:rPr/>
         <w:drawing>
           <wp:inline distB="114300" distT="114300" distL="114300" distR="114300">
-            <wp:extent cx="5133975" cy="2371725"/>
+            <wp:extent cx="5324475" cy="2638425"/>
             <wp:effectExtent b="0" l="0" r="0" t="0"/>
-            <wp:docPr id="17" name="image26.jpg"/>
+            <wp:docPr id="22" name="image20.jpg"/>
             <a:graphic>
               <a:graphicData uri="http://schemas.openxmlformats.org/drawingml/2006/picture">
                 <pic:pic>
                   <pic:nvPicPr>
-                    <pic:cNvPr id="0" name="image26.jpg"/>
+                    <pic:cNvPr id="0" name="image20.jpg"/>
                     <pic:cNvPicPr preferRelativeResize="0"/>
                   </pic:nvPicPr>
                   <pic:blipFill>
@@ -7853,7 +7929,7 @@
                   <pic:spPr>
                     <a:xfrm>
                       <a:off x="0" y="0"/>
-                      <a:ext cx="5133975" cy="2371725"/>
+                      <a:ext cx="5324475" cy="2638425"/>
                     </a:xfrm>
                     <a:prstGeom prst="rect"/>
                     <a:ln/>
@@ -7872,7 +7948,7 @@
     </w:p>
     <w:p>
       <w:pPr>
-        <w:spacing w:after="60" w:lineRule="auto"/>
+        <w:spacing w:after="60" w:line="276" w:lineRule="auto"/>
         <w:rPr>
           <w:b w:val="1"/>
           <w:bCs w:val="1"/>
@@ -8697,14 +8773,14 @@
         <w:rPr/>
         <w:drawing>
           <wp:inline distB="114300" distT="114300" distL="114300" distR="114300">
-            <wp:extent cx="6448475" cy="3588437"/>
+            <wp:extent cx="5731200" cy="3492500"/>
             <wp:effectExtent b="0" l="0" r="0" t="0"/>
-            <wp:docPr id="37" name="image13.png"/>
+            <wp:docPr id="33" name="image8.png"/>
             <a:graphic>
               <a:graphicData uri="http://schemas.openxmlformats.org/drawingml/2006/picture">
                 <pic:pic>
                   <pic:nvPicPr>
-                    <pic:cNvPr id="0" name="image13.png"/>
+                    <pic:cNvPr id="0" name="image8.png"/>
                     <pic:cNvPicPr preferRelativeResize="0"/>
                   </pic:nvPicPr>
                   <pic:blipFill>
@@ -8717,7 +8793,7 @@
                   <pic:spPr>
                     <a:xfrm>
                       <a:off x="0" y="0"/>
-                      <a:ext cx="6448475" cy="3588437"/>
+                      <a:ext cx="5731200" cy="3492500"/>
                     </a:xfrm>
                     <a:prstGeom prst="rect"/>
                     <a:ln/>
@@ -8737,11 +8813,7 @@
     <w:p>
       <w:pPr>
         <w:pStyle w:val="Heading3"/>
-        <w:rPr>
-          <w:i w:val="1"/>
-          <w:iCs w:val="1"/>
-          <w:color w:val="0000ff"/>
-        </w:rPr>
+        <w:rPr/>
       </w:pPr>
       <w:bookmarkStart w:colFirst="0" w:colLast="0" w:name="_heading=h.jycprxwmojub" w:id="5"/>
       <w:bookmarkEnd w:id="5"/>
@@ -8749,12 +8821,7 @@
         <w:rPr>
           <w:rtl w:val="0"/>
         </w:rPr>
-        <w:t xml:space="preserve">3.1 setting</w:t>
-      </w:r>
-      <w:r>
-        <w:rPr>
-          <w:rtl w:val="0"/>
-        </w:rPr>
+        <w:t xml:space="preserve">3.1 Setting</w:t>
       </w:r>
     </w:p>
     <w:tbl>
@@ -9876,7 +9943,7 @@
         <w:rPr>
           <w:rtl w:val="0"/>
         </w:rPr>
-        <w:t xml:space="preserve">3.2 user</w:t>
+        <w:t xml:space="preserve">3.2 User</w:t>
       </w:r>
     </w:p>
     <w:tbl>
@@ -10610,6 +10677,182 @@
               <w:rPr>
                 <w:rtl w:val="0"/>
               </w:rPr>
+            </w:r>
+          </w:p>
+        </w:tc>
+      </w:tr>
+      <w:tr>
+        <w:trPr>
+          <w:cantSplit w:val="0"/>
+          <w:trHeight w:val="285" w:hRule="atLeast"/>
+          <w:tblHeader w:val="0"/>
+        </w:trPr>
+        <w:tc>
+          <w:tcPr>
+            <w:tcBorders>
+              <w:top w:color="000000" w:space="0" w:sz="0" w:val="nil"/>
+              <w:left w:color="000000" w:space="0" w:sz="4" w:val="single"/>
+              <w:bottom w:color="000000" w:space="0" w:sz="4" w:val="single"/>
+              <w:right w:color="000000" w:space="0" w:sz="4" w:val="single"/>
+            </w:tcBorders>
+            <w:shd w:fill="auto" w:val="clear"/>
+            <w:vAlign w:val="center"/>
+          </w:tcPr>
+          <w:p>
+            <w:pPr>
+              <w:spacing w:after="0" w:line="240" w:lineRule="auto"/>
+              <w:rPr>
+                <w:color w:val="333333"/>
+              </w:rPr>
+            </w:pPr>
+            <w:r>
+              <w:rPr>
+                <w:color w:val="333333"/>
+                <w:rtl w:val="0"/>
+              </w:rPr>
+              <w:t xml:space="preserve">google_user_id</w:t>
+            </w:r>
+          </w:p>
+        </w:tc>
+        <w:tc>
+          <w:tcPr>
+            <w:tcBorders>
+              <w:top w:color="000000" w:space="0" w:sz="0" w:val="nil"/>
+              <w:left w:color="000000" w:space="0" w:sz="0" w:val="nil"/>
+              <w:bottom w:color="000000" w:space="0" w:sz="4" w:val="single"/>
+              <w:right w:color="000000" w:space="0" w:sz="4" w:val="single"/>
+            </w:tcBorders>
+            <w:shd w:fill="auto" w:val="clear"/>
+            <w:vAlign w:val="center"/>
+          </w:tcPr>
+          <w:p>
+            <w:pPr>
+              <w:spacing w:after="0" w:line="240" w:lineRule="auto"/>
+              <w:rPr>
+                <w:color w:val="333333"/>
+              </w:rPr>
+            </w:pPr>
+            <w:r>
+              <w:rPr>
+                <w:color w:val="333333"/>
+                <w:rtl w:val="0"/>
+              </w:rPr>
+              <w:t xml:space="preserve">NULL</w:t>
+            </w:r>
+          </w:p>
+        </w:tc>
+        <w:tc>
+          <w:tcPr>
+            <w:tcBorders>
+              <w:top w:color="000000" w:space="0" w:sz="0" w:val="nil"/>
+              <w:left w:color="000000" w:space="0" w:sz="0" w:val="nil"/>
+              <w:bottom w:color="000000" w:space="0" w:sz="4" w:val="single"/>
+              <w:right w:color="000000" w:space="0" w:sz="4" w:val="single"/>
+            </w:tcBorders>
+            <w:shd w:fill="auto" w:val="clear"/>
+            <w:vAlign w:val="center"/>
+          </w:tcPr>
+          <w:p>
+            <w:pPr>
+              <w:spacing w:after="0" w:line="240" w:lineRule="auto"/>
+              <w:rPr>
+                <w:color w:val="333333"/>
+              </w:rPr>
+            </w:pPr>
+            <w:r>
+              <w:rPr>
+                <w:color w:val="333333"/>
+                <w:rtl w:val="0"/>
+              </w:rPr>
+              <w:t xml:space="preserve">Unique id for using google account</w:t>
+            </w:r>
+          </w:p>
+        </w:tc>
+      </w:tr>
+      <w:tr>
+        <w:trPr>
+          <w:cantSplit w:val="0"/>
+          <w:trHeight w:val="285" w:hRule="atLeast"/>
+          <w:tblHeader w:val="0"/>
+        </w:trPr>
+        <w:tc>
+          <w:tcPr>
+            <w:tcBorders>
+              <w:top w:color="000000" w:space="0" w:sz="0" w:val="nil"/>
+              <w:left w:color="000000" w:space="0" w:sz="4" w:val="single"/>
+              <w:bottom w:color="000000" w:space="0" w:sz="4" w:val="single"/>
+              <w:right w:color="000000" w:space="0" w:sz="4" w:val="single"/>
+            </w:tcBorders>
+            <w:shd w:fill="auto" w:val="clear"/>
+            <w:vAlign w:val="center"/>
+          </w:tcPr>
+          <w:p>
+            <w:pPr>
+              <w:spacing w:after="0" w:line="240" w:lineRule="auto"/>
+              <w:rPr>
+                <w:color w:val="333333"/>
+              </w:rPr>
+            </w:pPr>
+            <w:r>
+              <w:rPr>
+                <w:color w:val="333333"/>
+                <w:rtl w:val="0"/>
+              </w:rPr>
+              <w:t xml:space="preserve">github_user_id</w:t>
+            </w:r>
+          </w:p>
+        </w:tc>
+        <w:tc>
+          <w:tcPr>
+            <w:tcBorders>
+              <w:top w:color="000000" w:space="0" w:sz="0" w:val="nil"/>
+              <w:left w:color="000000" w:space="0" w:sz="0" w:val="nil"/>
+              <w:bottom w:color="000000" w:space="0" w:sz="4" w:val="single"/>
+              <w:right w:color="000000" w:space="0" w:sz="4" w:val="single"/>
+            </w:tcBorders>
+            <w:shd w:fill="auto" w:val="clear"/>
+            <w:vAlign w:val="center"/>
+          </w:tcPr>
+          <w:p>
+            <w:pPr>
+              <w:spacing w:after="0" w:line="240" w:lineRule="auto"/>
+              <w:rPr>
+                <w:color w:val="333333"/>
+              </w:rPr>
+            </w:pPr>
+            <w:r>
+              <w:rPr>
+                <w:color w:val="333333"/>
+                <w:rtl w:val="0"/>
+              </w:rPr>
+              <w:t xml:space="preserve">NULL</w:t>
+            </w:r>
+          </w:p>
+        </w:tc>
+        <w:tc>
+          <w:tcPr>
+            <w:tcBorders>
+              <w:top w:color="000000" w:space="0" w:sz="0" w:val="nil"/>
+              <w:left w:color="000000" w:space="0" w:sz="0" w:val="nil"/>
+              <w:bottom w:color="000000" w:space="0" w:sz="4" w:val="single"/>
+              <w:right w:color="000000" w:space="0" w:sz="4" w:val="single"/>
+            </w:tcBorders>
+            <w:shd w:fill="auto" w:val="clear"/>
+            <w:vAlign w:val="center"/>
+          </w:tcPr>
+          <w:p>
+            <w:pPr>
+              <w:spacing w:after="0" w:line="240" w:lineRule="auto"/>
+              <w:rPr>
+                <w:color w:val="333333"/>
+              </w:rPr>
+            </w:pPr>
+            <w:r>
+              <w:rPr>
+                <w:color w:val="333333"/>
+                <w:rtl w:val="0"/>
+              </w:rPr>
+              <w:t xml:space="preserve">Unique id for using github account</w:t>
             </w:r>
           </w:p>
         </w:tc>
@@ -15580,6 +15823,91 @@
                 <w:rtl w:val="0"/>
               </w:rPr>
               <w:t xml:space="preserve">Time limit in minutes </w:t>
+            </w:r>
+          </w:p>
+        </w:tc>
+      </w:tr>
+      <w:tr>
+        <w:trPr>
+          <w:cantSplit w:val="0"/>
+          <w:trHeight w:val="285" w:hRule="atLeast"/>
+          <w:tblHeader w:val="0"/>
+        </w:trPr>
+        <w:tc>
+          <w:tcPr>
+            <w:tcBorders>
+              <w:top w:color="000000" w:space="0" w:sz="0" w:val="nil"/>
+              <w:left w:color="000000" w:space="0" w:sz="4" w:val="single"/>
+              <w:bottom w:color="000000" w:space="0" w:sz="4" w:val="single"/>
+              <w:right w:color="000000" w:space="0" w:sz="4" w:val="single"/>
+            </w:tcBorders>
+            <w:shd w:fill="auto" w:val="clear"/>
+            <w:vAlign w:val="center"/>
+          </w:tcPr>
+          <w:p>
+            <w:pPr>
+              <w:spacing w:after="0" w:line="240" w:lineRule="auto"/>
+              <w:rPr>
+                <w:color w:val="333333"/>
+              </w:rPr>
+            </w:pPr>
+            <w:r>
+              <w:rPr>
+                <w:color w:val="333333"/>
+                <w:rtl w:val="0"/>
+              </w:rPr>
+              <w:t xml:space="preserve">quiz_score</w:t>
+            </w:r>
+          </w:p>
+        </w:tc>
+        <w:tc>
+          <w:tcPr>
+            <w:tcBorders>
+              <w:top w:color="000000" w:space="0" w:sz="0" w:val="nil"/>
+              <w:left w:color="000000" w:space="0" w:sz="0" w:val="nil"/>
+              <w:bottom w:color="000000" w:space="0" w:sz="4" w:val="single"/>
+              <w:right w:color="000000" w:space="0" w:sz="4" w:val="single"/>
+            </w:tcBorders>
+            <w:shd w:fill="auto" w:val="clear"/>
+            <w:vAlign w:val="center"/>
+          </w:tcPr>
+          <w:p>
+            <w:pPr>
+              <w:spacing w:after="0" w:line="240" w:lineRule="auto"/>
+              <w:rPr>
+                <w:color w:val="333333"/>
+              </w:rPr>
+            </w:pPr>
+            <w:r>
+              <w:rPr>
+                <w:color w:val="333333"/>
+                <w:rtl w:val="0"/>
+              </w:rPr>
+              <w:t xml:space="preserve">NOT NULL</w:t>
+            </w:r>
+          </w:p>
+        </w:tc>
+        <w:tc>
+          <w:tcPr>
+            <w:tcBorders>
+              <w:top w:color="000000" w:space="0" w:sz="0" w:val="nil"/>
+              <w:left w:color="000000" w:space="0" w:sz="0" w:val="nil"/>
+              <w:bottom w:color="000000" w:space="0" w:sz="4" w:val="single"/>
+              <w:right w:color="000000" w:space="0" w:sz="4" w:val="single"/>
+            </w:tcBorders>
+            <w:shd w:fill="auto" w:val="clear"/>
+            <w:vAlign w:val="center"/>
+          </w:tcPr>
+          <w:p>
+            <w:pPr>
+              <w:spacing w:after="0" w:line="240" w:lineRule="auto"/>
+              <w:rPr/>
+            </w:pPr>
+            <w:r>
+              <w:rPr>
+                <w:rtl w:val="0"/>
+              </w:rPr>
+              <w:t xml:space="preserve">The minimum score to pass</w:t>
             </w:r>
           </w:p>
         </w:tc>
@@ -17414,7 +17742,7 @@
     <w:sdt>
       <w:sdtPr>
         <w:lock w:val="contentLocked"/>
-        <w:id w:val="1289788550"/>
+        <w:id w:val="-2109223631"/>
         <w:tag w:val="goog_rdk_0"/>
       </w:sdtPr>
       <w:sdtContent>
@@ -18081,7 +18409,7 @@
     <w:sdt>
       <w:sdtPr>
         <w:lock w:val="contentLocked"/>
-        <w:id w:val="-546432443"/>
+        <w:id w:val="-148591934"/>
         <w:tag w:val="goog_rdk_1"/>
       </w:sdtPr>
       <w:sdtContent>
@@ -18591,7 +18919,7 @@
     <w:sdt>
       <w:sdtPr>
         <w:lock w:val="contentLocked"/>
-        <w:id w:val="-548389707"/>
+        <w:id w:val="1146082936"/>
         <w:tag w:val="goog_rdk_2"/>
       </w:sdtPr>
       <w:sdtContent>
@@ -19387,12 +19715,12 @@
           <wp:inline distB="114300" distT="114300" distL="114300" distR="114300">
             <wp:extent cx="6526420" cy="5214632"/>
             <wp:effectExtent b="0" l="0" r="0" t="0"/>
-            <wp:docPr id="33" name="image20.png"/>
+            <wp:docPr id="34" name="image16.png"/>
             <a:graphic>
               <a:graphicData uri="http://schemas.openxmlformats.org/drawingml/2006/picture">
                 <pic:pic>
                   <pic:nvPicPr>
-                    <pic:cNvPr id="0" name="image20.png"/>
+                    <pic:cNvPr id="0" name="image16.png"/>
                     <pic:cNvPicPr preferRelativeResize="0"/>
                   </pic:nvPicPr>
                   <pic:blipFill>
@@ -19446,12 +19774,12 @@
           <wp:inline distB="114300" distT="114300" distL="114300" distR="114300">
             <wp:extent cx="6540106" cy="3127449"/>
             <wp:effectExtent b="0" l="0" r="0" t="0"/>
-            <wp:docPr id="19" name="image21.png"/>
+            <wp:docPr id="18" name="image23.png"/>
             <a:graphic>
               <a:graphicData uri="http://schemas.openxmlformats.org/drawingml/2006/picture">
                 <pic:pic>
                   <pic:nvPicPr>
-                    <pic:cNvPr id="0" name="image21.png"/>
+                    <pic:cNvPr id="0" name="image23.png"/>
                     <pic:cNvPicPr preferRelativeResize="0"/>
                   </pic:nvPicPr>
                   <pic:blipFill>
@@ -19508,12 +19836,12 @@
           <wp:inline distB="114300" distT="114300" distL="114300" distR="114300">
             <wp:extent cx="6531086" cy="3460824"/>
             <wp:effectExtent b="0" l="0" r="0" t="0"/>
-            <wp:docPr id="23" name="image19.png"/>
+            <wp:docPr id="23" name="image13.png"/>
             <a:graphic>
               <a:graphicData uri="http://schemas.openxmlformats.org/drawingml/2006/picture">
                 <pic:pic>
                   <pic:nvPicPr>
-                    <pic:cNvPr id="0" name="image19.png"/>
+                    <pic:cNvPr id="0" name="image13.png"/>
                     <pic:cNvPicPr preferRelativeResize="0"/>
                   </pic:nvPicPr>
                   <pic:blipFill>
@@ -19568,12 +19896,12 @@
           <wp:inline distB="114300" distT="114300" distL="114300" distR="114300">
             <wp:extent cx="5929313" cy="4471878"/>
             <wp:effectExtent b="0" l="0" r="0" t="0"/>
-            <wp:docPr id="24" name="image15.png"/>
+            <wp:docPr id="24" name="image14.png"/>
             <a:graphic>
               <a:graphicData uri="http://schemas.openxmlformats.org/drawingml/2006/picture">
                 <pic:pic>
                   <pic:nvPicPr>
-                    <pic:cNvPr id="0" name="image15.png"/>
+                    <pic:cNvPr id="0" name="image14.png"/>
                     <pic:cNvPicPr preferRelativeResize="0"/>
                   </pic:nvPicPr>
                   <pic:blipFill>
@@ -19648,12 +19976,12 @@
           <wp:inline distB="114300" distT="114300" distL="114300" distR="114300">
             <wp:extent cx="5731200" cy="2159000"/>
             <wp:effectExtent b="0" l="0" r="0" t="0"/>
-            <wp:docPr id="22" name="image25.png"/>
+            <wp:docPr id="21" name="image15.png"/>
             <a:graphic>
               <a:graphicData uri="http://schemas.openxmlformats.org/drawingml/2006/picture">
                 <pic:pic>
                   <pic:nvPicPr>
-                    <pic:cNvPr id="0" name="image25.png"/>
+                    <pic:cNvPr id="0" name="image15.png"/>
                     <pic:cNvPicPr preferRelativeResize="0"/>
                   </pic:nvPicPr>
                   <pic:blipFill>
@@ -19716,7 +20044,7 @@
           <wp:inline distB="114300" distT="114300" distL="114300" distR="114300">
             <wp:extent cx="6544395" cy="2641674"/>
             <wp:effectExtent b="0" l="0" r="0" t="0"/>
-            <wp:docPr id="20" name="image5.png"/>
+            <wp:docPr id="19" name="image5.png"/>
             <a:graphic>
               <a:graphicData uri="http://schemas.openxmlformats.org/drawingml/2006/picture">
                 <pic:pic>
@@ -19781,12 +20109,12 @@
           <wp:inline distB="114300" distT="114300" distL="114300" distR="114300">
             <wp:extent cx="6514268" cy="2499661"/>
             <wp:effectExtent b="0" l="0" r="0" t="0"/>
-            <wp:docPr id="30" name="image11.png"/>
+            <wp:docPr id="31" name="image19.png"/>
             <a:graphic>
               <a:graphicData uri="http://schemas.openxmlformats.org/drawingml/2006/picture">
                 <pic:pic>
                   <pic:nvPicPr>
-                    <pic:cNvPr id="0" name="image11.png"/>
+                    <pic:cNvPr id="0" name="image19.png"/>
                     <pic:cNvPicPr preferRelativeResize="0"/>
                   </pic:nvPicPr>
                   <pic:blipFill>
@@ -19854,12 +20182,12 @@
           <wp:inline distB="114300" distT="114300" distL="114300" distR="114300">
             <wp:extent cx="5731200" cy="4330700"/>
             <wp:effectExtent b="0" l="0" r="0" t="0"/>
-            <wp:docPr id="34" name="image22.png"/>
+            <wp:docPr id="35" name="image17.png"/>
             <a:graphic>
               <a:graphicData uri="http://schemas.openxmlformats.org/drawingml/2006/picture">
                 <pic:pic>
                   <pic:nvPicPr>
-                    <pic:cNvPr id="0" name="image22.png"/>
+                    <pic:cNvPr id="0" name="image17.png"/>
                     <pic:cNvPicPr preferRelativeResize="0"/>
                   </pic:nvPicPr>
                   <pic:blipFill>
@@ -19913,12 +20241,12 @@
           <wp:inline distB="114300" distT="114300" distL="114300" distR="114300">
             <wp:extent cx="5731200" cy="2413000"/>
             <wp:effectExtent b="0" l="0" r="0" t="0"/>
-            <wp:docPr id="28" name="image8.png"/>
+            <wp:docPr id="29" name="image7.png"/>
             <a:graphic>
               <a:graphicData uri="http://schemas.openxmlformats.org/drawingml/2006/picture">
                 <pic:pic>
                   <pic:nvPicPr>
-                    <pic:cNvPr id="0" name="image8.png"/>
+                    <pic:cNvPr id="0" name="image7.png"/>
                     <pic:cNvPicPr preferRelativeResize="0"/>
                   </pic:nvPicPr>
                   <pic:blipFill>
@@ -19978,12 +20306,12 @@
           <wp:inline distB="114300" distT="114300" distL="114300" distR="114300">
             <wp:extent cx="5731200" cy="2159000"/>
             <wp:effectExtent b="0" l="0" r="0" t="0"/>
-            <wp:docPr id="21" name="image6.png"/>
+            <wp:docPr id="20" name="image18.png"/>
             <a:graphic>
               <a:graphicData uri="http://schemas.openxmlformats.org/drawingml/2006/picture">
                 <pic:pic>
                   <pic:nvPicPr>
-                    <pic:cNvPr id="0" name="image6.png"/>
+                    <pic:cNvPr id="0" name="image18.png"/>
                     <pic:cNvPicPr preferRelativeResize="0"/>
                   </pic:nvPicPr>
                   <pic:blipFill>
@@ -20057,12 +20385,12 @@
           <wp:inline distB="114300" distT="114300" distL="114300" distR="114300">
             <wp:extent cx="6527635" cy="3513212"/>
             <wp:effectExtent b="0" l="0" r="0" t="0"/>
-            <wp:docPr id="14" name="image14.png"/>
+            <wp:docPr id="14" name="image21.png"/>
             <a:graphic>
               <a:graphicData uri="http://schemas.openxmlformats.org/drawingml/2006/picture">
                 <pic:pic>
                   <pic:nvPicPr>
-                    <pic:cNvPr id="0" name="image14.png"/>
+                    <pic:cNvPr id="0" name="image21.png"/>
                     <pic:cNvPicPr preferRelativeResize="0"/>
                   </pic:nvPicPr>
                   <pic:blipFill>
@@ -20122,12 +20450,12 @@
           <wp:inline distB="114300" distT="114300" distL="114300" distR="114300">
             <wp:extent cx="5731200" cy="2514600"/>
             <wp:effectExtent b="0" l="0" r="0" t="0"/>
-            <wp:docPr id="15" name="image9.png"/>
+            <wp:docPr id="15" name="image6.png"/>
             <a:graphic>
               <a:graphicData uri="http://schemas.openxmlformats.org/drawingml/2006/picture">
                 <pic:pic>
                   <pic:nvPicPr>
-                    <pic:cNvPr id="0" name="image9.png"/>
+                    <pic:cNvPr id="0" name="image6.png"/>
                     <pic:cNvPicPr preferRelativeResize="0"/>
                   </pic:nvPicPr>
                   <pic:blipFill>
@@ -20187,7 +20515,7 @@
           <wp:inline distB="114300" distT="114300" distL="114300" distR="114300">
             <wp:extent cx="5731200" cy="2146300"/>
             <wp:effectExtent b="0" l="0" r="0" t="0"/>
-            <wp:docPr id="27" name="image2.png"/>
+            <wp:docPr id="28" name="image2.png"/>
             <a:graphic>
               <a:graphicData uri="http://schemas.openxmlformats.org/drawingml/2006/picture">
                 <pic:pic>
@@ -20265,12 +20593,12 @@
           <wp:inline distB="114300" distT="114300" distL="114300" distR="114300">
             <wp:extent cx="5731200" cy="2628900"/>
             <wp:effectExtent b="0" l="0" r="0" t="0"/>
-            <wp:docPr id="16" name="image24.png"/>
+            <wp:docPr id="16" name="image25.png"/>
             <a:graphic>
               <a:graphicData uri="http://schemas.openxmlformats.org/drawingml/2006/picture">
                 <pic:pic>
                   <pic:nvPicPr>
-                    <pic:cNvPr id="0" name="image24.png"/>
+                    <pic:cNvPr id="0" name="image25.png"/>
                     <pic:cNvPicPr preferRelativeResize="0"/>
                   </pic:nvPicPr>
                   <pic:blipFill>
@@ -20324,12 +20652,12 @@
           <wp:inline distB="114300" distT="114300" distL="114300" distR="114300">
             <wp:extent cx="5731200" cy="3644900"/>
             <wp:effectExtent b="0" l="0" r="0" t="0"/>
-            <wp:docPr id="35" name="image23.png"/>
+            <wp:docPr id="37" name="image26.png"/>
             <a:graphic>
               <a:graphicData uri="http://schemas.openxmlformats.org/drawingml/2006/picture">
                 <pic:pic>
                   <pic:nvPicPr>
-                    <pic:cNvPr id="0" name="image23.png"/>
+                    <pic:cNvPr id="0" name="image26.png"/>
                     <pic:cNvPicPr preferRelativeResize="0"/>
                   </pic:nvPicPr>
                   <pic:blipFill>
@@ -20383,12 +20711,12 @@
           <wp:inline distB="114300" distT="114300" distL="114300" distR="114300">
             <wp:extent cx="5731200" cy="3594100"/>
             <wp:effectExtent b="0" l="0" r="0" t="0"/>
-            <wp:docPr id="12" name="image18.png"/>
+            <wp:docPr id="12" name="image24.png"/>
             <a:graphic>
               <a:graphicData uri="http://schemas.openxmlformats.org/drawingml/2006/picture">
                 <pic:pic>
                   <pic:nvPicPr>
-                    <pic:cNvPr id="0" name="image18.png"/>
+                    <pic:cNvPr id="0" name="image24.png"/>
                     <pic:cNvPicPr preferRelativeResize="0"/>
                   </pic:nvPicPr>
                   <pic:blipFill>
@@ -20467,12 +20795,12 @@
           <wp:inline distB="114300" distT="114300" distL="114300" distR="114300">
             <wp:extent cx="5731200" cy="4826000"/>
             <wp:effectExtent b="0" l="0" r="0" t="0"/>
-            <wp:docPr id="13" name="image7.png"/>
+            <wp:docPr id="13" name="image4.png"/>
             <a:graphic>
               <a:graphicData uri="http://schemas.openxmlformats.org/drawingml/2006/picture">
                 <pic:pic>
                   <pic:nvPicPr>
-                    <pic:cNvPr id="0" name="image7.png"/>
+                    <pic:cNvPr id="0" name="image4.png"/>
                     <pic:cNvPicPr preferRelativeResize="0"/>
                   </pic:nvPicPr>
                   <pic:blipFill>
@@ -20526,12 +20854,12 @@
           <wp:inline distB="114300" distT="114300" distL="114300" distR="114300">
             <wp:extent cx="5731200" cy="2882900"/>
             <wp:effectExtent b="0" l="0" r="0" t="0"/>
-            <wp:docPr id="18" name="image4.png"/>
+            <wp:docPr id="17" name="image1.png"/>
             <a:graphic>
               <a:graphicData uri="http://schemas.openxmlformats.org/drawingml/2006/picture">
                 <pic:pic>
                   <pic:nvPicPr>
-                    <pic:cNvPr id="0" name="image4.png"/>
+                    <pic:cNvPr id="0" name="image1.png"/>
                     <pic:cNvPicPr preferRelativeResize="0"/>
                   </pic:nvPicPr>
                   <pic:blipFill>
@@ -20580,12 +20908,12 @@
           <wp:inline distB="114300" distT="114300" distL="114300" distR="114300">
             <wp:extent cx="5731200" cy="3251200"/>
             <wp:effectExtent b="0" l="0" r="0" t="0"/>
-            <wp:docPr id="25" name="image10.png"/>
+            <wp:docPr id="25" name="image9.png"/>
             <a:graphic>
               <a:graphicData uri="http://schemas.openxmlformats.org/drawingml/2006/picture">
                 <pic:pic>
                   <pic:nvPicPr>
-                    <pic:cNvPr id="0" name="image10.png"/>
+                    <pic:cNvPr id="0" name="image9.png"/>
                     <pic:cNvPicPr preferRelativeResize="0"/>
                   </pic:nvPicPr>
                   <pic:blipFill>
@@ -20683,14 +21011,14 @@
         </w:rPr>
         <w:drawing>
           <wp:inline distB="114300" distT="114300" distL="114300" distR="114300">
-            <wp:extent cx="3519987" cy="7112801"/>
+            <wp:extent cx="2328863" cy="4625968"/>
             <wp:effectExtent b="0" l="0" r="0" t="0"/>
-            <wp:docPr id="31" name="image12.jpg"/>
+            <wp:docPr id="27" name="image22.jpg"/>
             <a:graphic>
               <a:graphicData uri="http://schemas.openxmlformats.org/drawingml/2006/picture">
                 <pic:pic>
                   <pic:nvPicPr>
-                    <pic:cNvPr id="0" name="image12.jpg"/>
+                    <pic:cNvPr id="0" name="image22.jpg"/>
                     <pic:cNvPicPr preferRelativeResize="0"/>
                   </pic:nvPicPr>
                   <pic:blipFill>
@@ -20703,7 +21031,7 @@
                   <pic:spPr>
                     <a:xfrm>
                       <a:off x="0" y="0"/>
-                      <a:ext cx="3519987" cy="7112801"/>
+                      <a:ext cx="2328863" cy="4625968"/>
                     </a:xfrm>
                     <a:prstGeom prst="rect"/>
                     <a:ln/>
@@ -20761,12 +21089,12 @@
           <wp:inline distB="114300" distT="114300" distL="114300" distR="114300">
             <wp:extent cx="5731200" cy="2184400"/>
             <wp:effectExtent b="0" l="0" r="0" t="0"/>
-            <wp:docPr id="26" name="image3.png"/>
+            <wp:docPr id="26" name="image10.png"/>
             <a:graphic>
               <a:graphicData uri="http://schemas.openxmlformats.org/drawingml/2006/picture">
                 <pic:pic>
                   <pic:nvPicPr>
-                    <pic:cNvPr id="0" name="image3.png"/>
+                    <pic:cNvPr id="0" name="image10.png"/>
                     <pic:cNvPicPr preferRelativeResize="0"/>
                   </pic:nvPicPr>
                   <pic:blipFill>
@@ -20837,12 +21165,12 @@
           <wp:inline distB="114300" distT="114300" distL="114300" distR="114300">
             <wp:extent cx="5731200" cy="2552700"/>
             <wp:effectExtent b="0" l="0" r="0" t="0"/>
-            <wp:docPr id="32" name="image17.jpg"/>
+            <wp:docPr id="32" name="image11.jpg"/>
             <a:graphic>
               <a:graphicData uri="http://schemas.openxmlformats.org/drawingml/2006/picture">
                 <pic:pic>
                   <pic:nvPicPr>
-                    <pic:cNvPr id="0" name="image17.jpg"/>
+                    <pic:cNvPr id="0" name="image11.jpg"/>
                     <pic:cNvPicPr preferRelativeResize="0"/>
                   </pic:nvPicPr>
                   <pic:blipFill>
@@ -21227,7 +21555,6 @@
       <w:spacing w:after="0" w:before="120" w:line="240" w:lineRule="auto"/>
     </w:pPr>
     <w:rPr>
-      <w:rFonts w:ascii="Calibri" w:cs="Calibri" w:eastAsia="Calibri" w:hAnsi="Calibri"/>
       <w:b w:val="1"/>
       <w:bCs w:val="1"/>
       <w:sz w:val="26"/>

</xml_diff>